<commit_message>
fix: harden fixture corpus authority
</commit_message>
<xml_diff>
--- a/fixtures/small/docx/malicious.docx
+++ b/fixtures/small/docx/malicious.docx
@@ -1,11 +1,13 @@
 
 <file path=word/document.xml><?xml version="1.0" encoding="utf-8"?>
-<w:document xmlns:w="http://schemas.openxmlformats.org/wordprocessingml/2006/main">
+<w:document xmlns:w="http://schemas.openxmlformats.org/wordprocessingml/2006/main" xmlns:r="http://schemas.openxmlformats.org/officeDocument/2006/relationships">
   <w:body>
     <w:p>
-      <w:r>
-        <w:t>Corpus Alpha 中文</w:t>
-      </w:r>
+      <w:hyperlink r:id="rId9">
+        <w:r>
+          <w:t>safe external link</w:t>
+        </w:r>
+      </w:hyperlink>
     </w:p>
   </w:body>
 </w:document>

</xml_diff>